<commit_message>
author: Ashish Kumar (full name) in manuscript + title page
</commit_message>
<xml_diff>
--- a/manuscript/manuscript_titlepage.docx
+++ b/manuscript/manuscript_titlepage.docx
@@ -27,7 +27,7 @@
           <w:i w:val="0"/>
           <w:sz w:val="24"/>
         </w:rPr>
-        <w:t>Ashish</w:t>
+        <w:t>Ashish Kumar</w:t>
       </w:r>
     </w:p>
     <w:p>
@@ -67,7 +67,7 @@
           <w:i w:val="0"/>
           <w:sz w:val="22"/>
         </w:rPr>
-        <w:t>Ashish</w:t>
+        <w:t>Ashish Kumar</w:t>
       </w:r>
     </w:p>
     <w:p>

</xml_diff>